<commit_message>
Record provider MFA guard Preview evidence and hosting requirements
</commit_message>
<xml_diff>
--- a/docs/reports/2026-10-16-provider-mfa-guard.docx
+++ b/docs/reports/2026-10-16-provider-mfa-guard.docx
@@ -74,7 +74,7 @@
     </w:p>
     <w:p>
       <w:r>
-        <w:t>Managed [Supabase Auth Hooks](https://supabase.com/docs/guides/auth/auth-hooks) currently lists MFA verification hooks for Teams and Enterprise. Local self-hosted support does not establish availability on the existing managed project. A compatible isolated managed project or authorized self-hosted service is required; no paid upgrade/resource creation is performed or presumed authorized.</w:t>
+        <w:t>Managed [Supabase Auth Hooks](https://supabase.com/docs/guides/auth/auth-hooks) currently lists MFA verification hooks for Teams and Enterprise. Local self-hosted support does not establish availability on the existing managed project. A compatible isolated managed project or authorized self-hosted service is required; no paid upgrade/resource creation is performed or presumed authorized. The current web adapter accepts managed project URLs and modern publishable keys. A self-hosted target additionally needs an explicit URL/key adapter review; the loopback test's transport rewrite is not a deployable self-hosted web adapter.</w:t>
       </w:r>
     </w:p>
     <w:p>
@@ -135,7 +135,7 @@
     </w:p>
     <w:p>
       <w:r>
-        <w:t>Read-only hosted role metadata confirms native Auth is non-superuser/NOBYPASSRLS; its existing provider CREATEROLE capability is unchanged. The existing migration administrator has BYPASSRLS/native session rights. Neither is a web runtime identity.</w:t>
+        <w:t>Read-only hosted role metadata confirms native Auth is non-superuser/NOBYPASSRLS; its existing provider CREATEROLE capability is unchanged. The existing migration administrator has BYPASSRLS/native session rights. Neither is a web runtime identity. At 17:08 UTC, the read-only hosted security advisor still reports only one existing INFO for the intentionally closed vendor-reviewer audit table with no RLS policy; [advisor guidance](https://supabase.com/docs/guides/database/database-linter?lint=0008_rls_enabled_no_policy). This does not assess the three unapplied Phase 1 migrations or establish their hosted acceptance.</w:t>
       </w:r>
     </w:p>
     <w:p>
@@ -1007,7 +1007,17 @@
     </w:p>
     <w:p>
       <w:r>
-        <w:t>DELIVERY_PENDING_FINAL_SOURCE</w:t>
+        <w:t>Source b60b59e3488eed14a50c17286cf9ad9367d138a2 is committed and pushed on codex/phase-1-mfa-privileged-security. Independent remote refs confirm it and the unchanged main. Twenty reviewed files were staged explicitly; the user next-env edit and supplied attachments remain unstaged. Final evidence changes only docs; no runtime source follows this verified source commit.</w:t>
+      </w:r>
+    </w:p>
+    <w:p>
+      <w:r>
+        <w:t>Vercel's read-only API confirms that exact source READY with matching gitSource SHA/review branch, deployment dpl_72cNVh62FrBxx3gionSTz7LTMCqf: https://virtual-f2xm5ktgv-shadowrootsec-5679.vercel.app.</w:t>
+      </w:r>
+    </w:p>
+    <w:p>
+      <w:r>
+        <w:t>At 2026-10-16T17:07:00.873Z all four credential-free probes are BLOCKED by Vercel deployment protection. Three GETs return 302 to Vercel SSO; the status POST returns Vercel's 401. The probe exits 2 for blocked. Zero application passes are claimed; no genuine callback, MFA, role write, runtime log, secure-cookie/header or isolated resource result follows from those responses. No protection was disabled, bypass token retrieved or private cookie extracted. The installed CLI runtime was used only for read-only deployment metadata; application tests use Node 24.21.0. Source hosting does not install or enable the database/provider hook.</w:t>
       </w:r>
     </w:p>
     <w:p>

</xml_diff>